<commit_message>
Add session cleanup endpoint + fix scoring cap
- DELETE /api/dashboard/sessions/cleanup removes all 0-score sessions
  for the current user from the LIVE server's in-memory DB
- This solves the issue where shell commands only affected a separate
  process's DB copy while the running server kept stale data
- Assessment scoring now caps student scores at actual question count

Co-Authored-By: Claude Opus 4.6 (1M context) <noreply@anthropic.com>
</commit_message>
<xml_diff>
--- a/chem.docx
+++ b/chem.docx
@@ -417,6 +417,317 @@
           <w:iCs/>
         </w:rPr>
         <w:t>"End Session"</w:t>
+      </w:r>
+    </w:p>
+    <w:p>
+      <w:r>
+        <w:br w:type="page"/>
+      </w:r>
+    </w:p>
+    <w:p>
+      <w:pPr>
+        <w:rPr>
+          <w:b/>
+          <w:bCs/>
+        </w:rPr>
+      </w:pPr>
+      <w:r>
+        <w:rPr>
+          <w:rFonts w:ascii="Segoe UI Emoji" w:hAnsi="Segoe UI Emoji" w:cs="Segoe UI Emoji"/>
+          <w:b/>
+          <w:bCs/>
+        </w:rPr>
+        <w:lastRenderedPageBreak/>
+        <w:t>🔬</w:t>
+      </w:r>
+      <w:r>
+        <w:rPr>
+          <w:b/>
+          <w:bCs/>
+        </w:rPr>
+        <w:t xml:space="preserve"> Physics — Force &amp; Pressure (P7.1): Brick on Rubber Sheet</w:t>
+      </w:r>
+    </w:p>
+    <w:p>
+      <w:r>
+        <w:rPr>
+          <w:b/>
+          <w:bCs/>
+        </w:rPr>
+        <w:t>[Step 1 — Setup]</w:t>
+      </w:r>
+    </w:p>
+    <w:p>
+      <w:r>
+        <w:t>"Good morning class! Today we're going to discover something fascinating about force and pressure. Look at what I have here — a brick, a rubber sheet, and two wooden supports. Priya, have you ever wondered why a sharp knife cuts better than a blunt one? Let's find out!"</w:t>
+      </w:r>
+    </w:p>
+    <w:p>
+      <w:r>
+        <w:rPr>
+          <w:b/>
+          <w:bCs/>
+        </w:rPr>
+        <w:t>[Step 2 — Brick flat]</w:t>
+      </w:r>
+    </w:p>
+    <w:p>
+      <w:r>
+        <w:t xml:space="preserve">"Watch carefully. I'm placing the brick flat on the rubber sheet — the widest face is touching. Everyone </w:t>
+      </w:r>
+      <w:proofErr w:type="gramStart"/>
+      <w:r>
+        <w:t>look</w:t>
+      </w:r>
+      <w:proofErr w:type="gramEnd"/>
+      <w:r>
+        <w:t xml:space="preserve"> at how much the sheet sags down. Ravi, what do you observe? Does it </w:t>
+      </w:r>
+      <w:proofErr w:type="spellStart"/>
+      <w:proofErr w:type="gramStart"/>
+      <w:r>
+        <w:t>sag</w:t>
+      </w:r>
+      <w:proofErr w:type="spellEnd"/>
+      <w:proofErr w:type="gramEnd"/>
+      <w:r>
+        <w:t xml:space="preserve"> a lot or a little?"</w:t>
+      </w:r>
+    </w:p>
+    <w:p>
+      <w:r>
+        <w:t>"Meena, can you tell me — is the brick heavy or light? And Lakshmi, what do you think is pushing the sheet down?"</w:t>
+      </w:r>
+    </w:p>
+    <w:p>
+      <w:r>
+        <w:rPr>
+          <w:b/>
+          <w:bCs/>
+        </w:rPr>
+        <w:t>[Step 3 — Brick on side]</w:t>
+      </w:r>
+    </w:p>
+    <w:p>
+      <w:r>
+        <w:t>"Now I'm turning the brick on its side — the medium face. Same brick, same weight. Arjun, come look — does the sheet sag more or less than before? Why do you think that is?"</w:t>
+      </w:r>
+    </w:p>
+    <w:p>
+      <w:r>
+        <w:t>"Priya, the brick weighs exactly the same, so the force hasn't changed. But the area touching the sheet is smaller now. What's happening?"</w:t>
+      </w:r>
+    </w:p>
+    <w:p>
+      <w:r>
+        <w:rPr>
+          <w:b/>
+          <w:bCs/>
+        </w:rPr>
+        <w:t>[Step 4 — Brick on end]</w:t>
+      </w:r>
+    </w:p>
+    <w:p>
+      <w:r>
+        <w:t>"Final test — the brick on its smallest face, standing up like a pillar. Lakshmi, what do you predict will happen? Look — the sheet sags the MOST now! Ravi, can you explain why?"</w:t>
+      </w:r>
+    </w:p>
+    <w:p>
+      <w:r>
+        <w:t xml:space="preserve">"The force is the same. The area is </w:t>
+      </w:r>
+      <w:proofErr w:type="gramStart"/>
+      <w:r>
+        <w:t>smallest</w:t>
+      </w:r>
+      <w:proofErr w:type="gramEnd"/>
+      <w:r>
+        <w:t xml:space="preserve">. </w:t>
+      </w:r>
+      <w:proofErr w:type="gramStart"/>
+      <w:r>
+        <w:t>So</w:t>
+      </w:r>
+      <w:proofErr w:type="gramEnd"/>
+      <w:r>
+        <w:t xml:space="preserve"> the pressure is greatest. This is our formula: </w:t>
+      </w:r>
+      <w:r>
+        <w:rPr>
+          <w:b/>
+          <w:bCs/>
+        </w:rPr>
+        <w:t>Pressure = Force divided by Area</w:t>
+      </w:r>
+      <w:r>
+        <w:t>. When area decreases, pressure increases. This is why a sharp knife cuts — small area, high pressure!"</w:t>
+      </w:r>
+    </w:p>
+    <w:p>
+      <w:r>
+        <w:t xml:space="preserve">"Arjun, now do you understand why stiletto heels leave marks on wooden </w:t>
+      </w:r>
+      <w:proofErr w:type="gramStart"/>
+      <w:r>
+        <w:t>floors</w:t>
+      </w:r>
+      <w:proofErr w:type="gramEnd"/>
+      <w:r>
+        <w:t xml:space="preserve"> but flat shoes don't? Meena, don't just memorize the formula — think about WHY it works."</w:t>
+      </w:r>
+    </w:p>
+    <w:p>
+      <w:pPr>
+        <w:rPr>
+          <w:rFonts w:ascii="Segoe UI Emoji" w:hAnsi="Segoe UI Emoji" w:cs="Segoe UI Emoji"/>
+          <w:b/>
+          <w:bCs/>
+        </w:rPr>
+      </w:pPr>
+      <w:r>
+        <w:rPr>
+          <w:rFonts w:ascii="Segoe UI Emoji" w:hAnsi="Segoe UI Emoji" w:cs="Segoe UI Emoji"/>
+          <w:b/>
+          <w:bCs/>
+        </w:rPr>
+        <w:br w:type="page"/>
+      </w:r>
+    </w:p>
+    <w:p>
+      <w:pPr>
+        <w:rPr>
+          <w:b/>
+          <w:bCs/>
+        </w:rPr>
+      </w:pPr>
+      <w:r>
+        <w:rPr>
+          <w:rFonts w:ascii="Segoe UI Emoji" w:hAnsi="Segoe UI Emoji" w:cs="Segoe UI Emoji"/>
+          <w:b/>
+          <w:bCs/>
+        </w:rPr>
+        <w:lastRenderedPageBreak/>
+        <w:t>📐</w:t>
+      </w:r>
+      <w:r>
+        <w:rPr>
+          <w:b/>
+          <w:bCs/>
+        </w:rPr>
+        <w:t xml:space="preserve"> Mathematics — Triangles (M1.1): Types &amp; Angle Sum Property</w:t>
+      </w:r>
+    </w:p>
+    <w:p>
+      <w:r>
+        <w:rPr>
+          <w:b/>
+          <w:bCs/>
+        </w:rPr>
+        <w:t>[Step 1 — Triangle types]</w:t>
+      </w:r>
+    </w:p>
+    <w:p>
+      <w:r>
+        <w:t xml:space="preserve">"Good </w:t>
+      </w:r>
+      <w:proofErr w:type="gramStart"/>
+      <w:r>
+        <w:t>morning</w:t>
+      </w:r>
+      <w:proofErr w:type="gramEnd"/>
+      <w:r>
+        <w:t xml:space="preserve"> everyone! Today we're going to discover a beautiful secret that every triangle in the universe shares. But first — Priya, can you tell me what a triangle is? How many sides does it have?"</w:t>
+      </w:r>
+    </w:p>
+    <w:p>
+      <w:r>
+        <w:t>"Look at these four triangles on our board. They look very different, don't they? Ravi, do you think all triangles follow the same rules, or are some special?"</w:t>
+      </w:r>
+    </w:p>
+    <w:p>
+      <w:r>
+        <w:rPr>
+          <w:b/>
+          <w:bCs/>
+        </w:rPr>
+        <w:t>[Step 2 — Measuring angles]</w:t>
+      </w:r>
+    </w:p>
+    <w:p>
+      <w:r>
+        <w:t>"Let's name our triangles. This one has all three sides equal — Meena, what do we call it? Yes, equilateral! And this one has two sides equal — Lakshmi, do you know the name? It's isosceles."</w:t>
+      </w:r>
+    </w:p>
+    <w:p>
+      <w:r>
+        <w:t>"Arjun, look at this triangle — all three sides are different lengths. What should we call it? It's called scalene. And this one has a 90-degree angle — a right triangle."</w:t>
+      </w:r>
+    </w:p>
+    <w:p>
+      <w:r>
+        <w:rPr>
+          <w:b/>
+          <w:bCs/>
+        </w:rPr>
+        <w:t>[Step 3 — Cutting corners]</w:t>
+      </w:r>
+    </w:p>
+    <w:p>
+      <w:r>
+        <w:t xml:space="preserve">"Now here's where it gets exciting. I'm going to cut out the three corners of this triangle. Everyone </w:t>
+      </w:r>
+      <w:proofErr w:type="gramStart"/>
+      <w:r>
+        <w:t>watch</w:t>
+      </w:r>
+      <w:proofErr w:type="gramEnd"/>
+      <w:r>
+        <w:t xml:space="preserve"> — I'm </w:t>
+      </w:r>
+      <w:proofErr w:type="gramStart"/>
+      <w:r>
+        <w:t>labeling</w:t>
+      </w:r>
+      <w:proofErr w:type="gramEnd"/>
+      <w:r>
+        <w:t xml:space="preserve"> them A, B, and C with different colors. Priya, what do you think will happen if I arrange these three angles next to each other on a straight line?"</w:t>
+      </w:r>
+    </w:p>
+    <w:p>
+      <w:r>
+        <w:t>"Lakshmi, I'd love to hear your prediction — what shape do you think the three angles will make together?"</w:t>
+      </w:r>
+    </w:p>
+    <w:p>
+      <w:r>
+        <w:rPr>
+          <w:b/>
+          <w:bCs/>
+        </w:rPr>
+        <w:t>[Step 4 — The 180° proof]</w:t>
+      </w:r>
+    </w:p>
+    <w:p>
+      <w:r>
+        <w:t>"Look! When I place all three angles together on this line — A, then B, then C — they form a perfectly straight line! Ravi, what does a straight line measure in degrees? Exactly — 180 degrees!"</w:t>
+      </w:r>
+    </w:p>
+    <w:p>
+      <w:r>
+        <w:t>"</w:t>
+      </w:r>
+      <w:proofErr w:type="gramStart"/>
+      <w:r>
+        <w:t>So</w:t>
+      </w:r>
+      <w:proofErr w:type="gramEnd"/>
+      <w:r>
+        <w:t xml:space="preserve"> the three angles of ANY triangle always add up to 180 degrees. This works for equilateral, isosceles, scalene, right-angled — every triangle in existence! Arjun, isn't that amazing? One simple rule for every triangle you'll ever meet."</w:t>
+      </w:r>
+    </w:p>
+    <w:p>
+      <w:r>
+        <w:t>"Meena, don't just memorize '180 degrees.' Think about WHY — we proved it by physically cutting and arranging. The proof is in your hands!"</w:t>
       </w:r>
     </w:p>
     <w:p/>
@@ -1033,7 +1344,6 @@
   <w:style w:type="character" w:default="1" w:styleId="DefaultParagraphFont">
     <w:name w:val="Default Paragraph Font"/>
     <w:uiPriority w:val="1"/>
-    <w:semiHidden/>
     <w:unhideWhenUsed/>
   </w:style>
   <w:style w:type="table" w:default="1" w:styleId="TableNormal">

</xml_diff>